<commit_message>
Adding comparison with multilingual-e5-small and benchmarking on Mr.TyDi-ar and MIRACL-ar datasets
</commit_message>
<xml_diff>
--- a/docs/thesis/fa/thesis_master.docx
+++ b/docs/thesis/fa/thesis_master.docx
@@ -499,7 +499,7 @@
                 <w:szCs w:val="21"/>
                 <w:rtl/>
               </w:rPr>
-              <w:t>مقایسهٔ بهترین SF با BM25 روی ۱۱ بنچمارک (MRR)</w:t>
+              <w:t>مقایسهٔ بهترین SF با BM25 روی ۱۳ بنچمارک (MRR)</w:t>
             </w:r>
           </w:p>
         </w:tc>
@@ -1403,6 +1403,68 @@
                 <w:szCs w:val="21"/>
                 <w:rtl/>
               </w:rPr>
+              <w:t>MRR خط مبنای E5-multi در برابر بهترین SF و BM25</w:t>
+            </w:r>
+          </w:p>
+        </w:tc>
+        <w:tc>
+          <w:tcPr>
+            <w:tcW w:type="dxa" w:w="3216"/>
+          </w:tcPr>
+          <w:p>
+            <w:pPr>
+              <w:jc w:val="center"/>
+            </w:pPr>
+            <w:r/>
+            <w:r>
+              <w:rPr>
+                <w:rFonts w:ascii="Times New Roman" w:hAnsi="Times New Roman" w:cs="B Nazanin"/>
+                <w:sz w:val="21"/>
+                <w:szCs w:val="21"/>
+                <w:rtl/>
+              </w:rPr>
+              <w:t>۴-۷-۱</w:t>
+            </w:r>
+          </w:p>
+        </w:tc>
+      </w:tr>
+      <w:tr>
+        <w:tc>
+          <w:tcPr>
+            <w:tcW w:type="dxa" w:w="3216"/>
+          </w:tcPr>
+          <w:p>
+            <w:pPr>
+              <w:jc w:val="right"/>
+            </w:pPr>
+            <w:r/>
+            <w:r>
+              <w:rPr>
+                <w:rFonts w:ascii="Times New Roman" w:hAnsi="Times New Roman" w:cs="B Nazanin"/>
+                <w:sz w:val="21"/>
+                <w:szCs w:val="21"/>
+                <w:rtl/>
+              </w:rPr>
+              <w:t>جدول ۴-۹</w:t>
+            </w:r>
+          </w:p>
+        </w:tc>
+        <w:tc>
+          <w:tcPr>
+            <w:tcW w:type="dxa" w:w="3216"/>
+          </w:tcPr>
+          <w:p>
+            <w:pPr>
+              <w:jc w:val="center"/>
+            </w:pPr>
+            <w:r/>
+            <w:r>
+              <w:rPr>
+                <w:rFonts w:ascii="Times New Roman" w:hAnsi="Times New Roman" w:cs="B Nazanin"/>
+                <w:sz w:val="21"/>
+                <w:szCs w:val="21"/>
+                <w:rtl/>
+              </w:rPr>
               <w:t>مقایسهٔ ادبی با مدل‌های تعبیه کلمات</w:t>
             </w:r>
           </w:p>
@@ -2220,7 +2282,7 @@
           <w:szCs w:val="24"/>
           <w:rtl/>
         </w:rPr>
-        <w:t>1. پیاده‌سازی کامل و بازتولیدپذیر خط لولهٔ خوشه‌بندی معنایی برای بازیابی در دامنه بسته (اولین ارزیابی نظام‌مند این روش روی ۱۲ مجموعه‌داده استاندارد).</w:t>
+        <w:t>1. پیاده‌سازی کامل و بازتولیدپذیر خط لولهٔ خوشه‌بندی معنایی برای بازیابی در دامنه بسته (اولین ارزیابی نظام‌مند این روش روی ۱۴ مجموعه‌داده استاندارد).</w:t>
       </w:r>
     </w:p>
     <w:p>
@@ -8250,6 +8312,210 @@
           </w:p>
         </w:tc>
       </w:tr>
+      <w:tr>
+        <w:tc>
+          <w:tcPr>
+            <w:tcW w:type="dxa" w:w="1930"/>
+          </w:tcPr>
+          <w:p>
+            <w:pPr>
+              <w:jc w:val="right"/>
+            </w:pPr>
+            <w:r/>
+            <w:r>
+              <w:rPr>
+                <w:rFonts w:ascii="Times New Roman" w:hAnsi="Times New Roman" w:cs="B Nazanin"/>
+                <w:sz w:val="21"/>
+                <w:szCs w:val="21"/>
+                <w:rtl/>
+              </w:rPr>
+              <w:t>Mr.TyDi-ar [59]</w:t>
+            </w:r>
+          </w:p>
+        </w:tc>
+        <w:tc>
+          <w:tcPr>
+            <w:tcW w:type="dxa" w:w="1930"/>
+          </w:tcPr>
+          <w:p>
+            <w:pPr>
+              <w:jc w:val="center"/>
+            </w:pPr>
+            <w:r/>
+            <w:r>
+              <w:rPr>
+                <w:rFonts w:ascii="Times New Roman" w:hAnsi="Times New Roman" w:cs="B Nazanin"/>
+                <w:sz w:val="21"/>
+                <w:szCs w:val="21"/>
+                <w:rtl/>
+              </w:rPr>
+              <w:t>عربی</w:t>
+            </w:r>
+          </w:p>
+        </w:tc>
+        <w:tc>
+          <w:tcPr>
+            <w:tcW w:type="dxa" w:w="1930"/>
+          </w:tcPr>
+          <w:p>
+            <w:pPr>
+              <w:jc w:val="center"/>
+            </w:pPr>
+            <w:r/>
+            <w:r>
+              <w:rPr>
+                <w:rFonts w:ascii="Times New Roman" w:hAnsi="Times New Roman" w:cs="B Nazanin"/>
+                <w:sz w:val="21"/>
+                <w:szCs w:val="21"/>
+                <w:rtl/>
+              </w:rPr>
+              <w:t>~۵٫۲k قطعهٔ pooled</w:t>
+            </w:r>
+          </w:p>
+        </w:tc>
+        <w:tc>
+          <w:tcPr>
+            <w:tcW w:type="dxa" w:w="1930"/>
+          </w:tcPr>
+          <w:p>
+            <w:pPr>
+              <w:jc w:val="center"/>
+            </w:pPr>
+            <w:r/>
+            <w:r>
+              <w:rPr>
+                <w:rFonts w:ascii="Times New Roman" w:hAnsi="Times New Roman" w:cs="B Nazanin"/>
+                <w:sz w:val="21"/>
+                <w:szCs w:val="21"/>
+                <w:rtl/>
+              </w:rPr>
+              <w:t>۱۹۹ (pool=100)</w:t>
+            </w:r>
+          </w:p>
+        </w:tc>
+        <w:tc>
+          <w:tcPr>
+            <w:tcW w:type="dxa" w:w="1930"/>
+          </w:tcPr>
+          <w:p>
+            <w:pPr>
+              <w:jc w:val="center"/>
+            </w:pPr>
+            <w:r/>
+            <w:r>
+              <w:rPr>
+                <w:rFonts w:ascii="Times New Roman" w:hAnsi="Times New Roman" w:cs="B Nazanin"/>
+                <w:sz w:val="21"/>
+                <w:szCs w:val="21"/>
+                <w:rtl/>
+              </w:rPr>
+              <w:t>چندزبانهٔ باز</w:t>
+            </w:r>
+          </w:p>
+        </w:tc>
+      </w:tr>
+      <w:tr>
+        <w:tc>
+          <w:tcPr>
+            <w:tcW w:type="dxa" w:w="1930"/>
+          </w:tcPr>
+          <w:p>
+            <w:pPr>
+              <w:jc w:val="right"/>
+            </w:pPr>
+            <w:r/>
+            <w:r>
+              <w:rPr>
+                <w:rFonts w:ascii="Times New Roman" w:hAnsi="Times New Roman" w:cs="B Nazanin"/>
+                <w:sz w:val="21"/>
+                <w:szCs w:val="21"/>
+                <w:rtl/>
+              </w:rPr>
+              <w:t>MIRACL-ar [60]</w:t>
+            </w:r>
+          </w:p>
+        </w:tc>
+        <w:tc>
+          <w:tcPr>
+            <w:tcW w:type="dxa" w:w="1930"/>
+          </w:tcPr>
+          <w:p>
+            <w:pPr>
+              <w:jc w:val="center"/>
+            </w:pPr>
+            <w:r/>
+            <w:r>
+              <w:rPr>
+                <w:rFonts w:ascii="Times New Roman" w:hAnsi="Times New Roman" w:cs="B Nazanin"/>
+                <w:sz w:val="21"/>
+                <w:szCs w:val="21"/>
+                <w:rtl/>
+              </w:rPr>
+              <w:t>عربی</w:t>
+            </w:r>
+          </w:p>
+        </w:tc>
+        <w:tc>
+          <w:tcPr>
+            <w:tcW w:type="dxa" w:w="1930"/>
+          </w:tcPr>
+          <w:p>
+            <w:pPr>
+              <w:jc w:val="center"/>
+            </w:pPr>
+            <w:r/>
+            <w:r>
+              <w:rPr>
+                <w:rFonts w:ascii="Times New Roman" w:hAnsi="Times New Roman" w:cs="B Nazanin"/>
+                <w:sz w:val="21"/>
+                <w:szCs w:val="21"/>
+                <w:rtl/>
+              </w:rPr>
+              <w:t>~۵٫۴k قطعهٔ pooled</w:t>
+            </w:r>
+          </w:p>
+        </w:tc>
+        <w:tc>
+          <w:tcPr>
+            <w:tcW w:type="dxa" w:w="1930"/>
+          </w:tcPr>
+          <w:p>
+            <w:pPr>
+              <w:jc w:val="center"/>
+            </w:pPr>
+            <w:r/>
+            <w:r>
+              <w:rPr>
+                <w:rFonts w:ascii="Times New Roman" w:hAnsi="Times New Roman" w:cs="B Nazanin"/>
+                <w:sz w:val="21"/>
+                <w:szCs w:val="21"/>
+                <w:rtl/>
+              </w:rPr>
+              <w:t>۲۰۰ (pool=100)</w:t>
+            </w:r>
+          </w:p>
+        </w:tc>
+        <w:tc>
+          <w:tcPr>
+            <w:tcW w:type="dxa" w:w="1930"/>
+          </w:tcPr>
+          <w:p>
+            <w:pPr>
+              <w:jc w:val="center"/>
+            </w:pPr>
+            <w:r/>
+            <w:r>
+              <w:rPr>
+                <w:rFonts w:ascii="Times New Roman" w:hAnsi="Times New Roman" w:cs="B Nazanin"/>
+                <w:sz w:val="21"/>
+                <w:szCs w:val="21"/>
+                <w:rtl/>
+              </w:rPr>
+              <w:t>چندزبانهٔ باز</w:t>
+            </w:r>
+          </w:p>
+        </w:tc>
+      </w:tr>
     </w:tbl>
     <w:p/>
     <w:p>
@@ -10350,6 +10616,290 @@
           </w:p>
         </w:tc>
       </w:tr>
+      <w:tr>
+        <w:tc>
+          <w:tcPr>
+            <w:tcW w:type="dxa" w:w="1378"/>
+          </w:tcPr>
+          <w:p>
+            <w:pPr>
+              <w:jc w:val="right"/>
+            </w:pPr>
+            <w:r/>
+            <w:r>
+              <w:rPr>
+                <w:rFonts w:ascii="Times New Roman" w:hAnsi="Times New Roman" w:cs="B Nazanin"/>
+                <w:sz w:val="21"/>
+                <w:szCs w:val="21"/>
+                <w:rtl/>
+              </w:rPr>
+              <w:t>13</w:t>
+            </w:r>
+          </w:p>
+        </w:tc>
+        <w:tc>
+          <w:tcPr>
+            <w:tcW w:type="dxa" w:w="1378"/>
+          </w:tcPr>
+          <w:p>
+            <w:pPr>
+              <w:jc w:val="center"/>
+            </w:pPr>
+            <w:r/>
+            <w:r>
+              <w:rPr>
+                <w:rFonts w:ascii="Times New Roman" w:hAnsi="Times New Roman" w:cs="B Nazanin"/>
+                <w:sz w:val="21"/>
+                <w:szCs w:val="21"/>
+                <w:rtl/>
+              </w:rPr>
+              <w:t>Mr.TyDi-ar (199q, pool=100)</w:t>
+            </w:r>
+          </w:p>
+        </w:tc>
+        <w:tc>
+          <w:tcPr>
+            <w:tcW w:type="dxa" w:w="1378"/>
+          </w:tcPr>
+          <w:p>
+            <w:pPr>
+              <w:jc w:val="center"/>
+            </w:pPr>
+            <w:r/>
+            <w:r>
+              <w:rPr>
+                <w:rFonts w:ascii="Times New Roman" w:hAnsi="Times New Roman" w:cs="B Nazanin"/>
+                <w:sz w:val="21"/>
+                <w:szCs w:val="21"/>
+                <w:rtl/>
+              </w:rPr>
+              <w:t>Pure SF</w:t>
+            </w:r>
+          </w:p>
+        </w:tc>
+        <w:tc>
+          <w:tcPr>
+            <w:tcW w:type="dxa" w:w="1378"/>
+          </w:tcPr>
+          <w:p>
+            <w:pPr>
+              <w:jc w:val="center"/>
+            </w:pPr>
+            <w:r/>
+            <w:r>
+              <w:rPr>
+                <w:rFonts w:ascii="Times New Roman" w:hAnsi="Times New Roman" w:cs="B Nazanin"/>
+                <w:sz w:val="21"/>
+                <w:szCs w:val="21"/>
+                <w:rtl/>
+              </w:rPr>
+              <w:t>0.5436</w:t>
+            </w:r>
+          </w:p>
+        </w:tc>
+        <w:tc>
+          <w:tcPr>
+            <w:tcW w:type="dxa" w:w="1378"/>
+          </w:tcPr>
+          <w:p>
+            <w:pPr>
+              <w:jc w:val="center"/>
+            </w:pPr>
+            <w:r/>
+            <w:r>
+              <w:rPr>
+                <w:rFonts w:ascii="Times New Roman" w:hAnsi="Times New Roman" w:cs="B Nazanin"/>
+                <w:sz w:val="21"/>
+                <w:szCs w:val="21"/>
+                <w:rtl/>
+              </w:rPr>
+              <w:t>0.5436§</w:t>
+            </w:r>
+          </w:p>
+        </w:tc>
+        <w:tc>
+          <w:tcPr>
+            <w:tcW w:type="dxa" w:w="1378"/>
+          </w:tcPr>
+          <w:p>
+            <w:pPr>
+              <w:jc w:val="center"/>
+            </w:pPr>
+            <w:r/>
+            <w:r>
+              <w:rPr>
+                <w:rFonts w:ascii="Times New Roman" w:hAnsi="Times New Roman" w:cs="B Nazanin"/>
+                <w:sz w:val="21"/>
+                <w:szCs w:val="21"/>
+                <w:rtl/>
+              </w:rPr>
+              <w:t>0.8806 / 0.8806§</w:t>
+            </w:r>
+          </w:p>
+        </w:tc>
+        <w:tc>
+          <w:tcPr>
+            <w:tcW w:type="dxa" w:w="1378"/>
+          </w:tcPr>
+          <w:p>
+            <w:pPr>
+              <w:jc w:val="center"/>
+            </w:pPr>
+            <w:r/>
+            <w:r>
+              <w:rPr>
+                <w:rFonts w:ascii="Times New Roman" w:hAnsi="Times New Roman" w:cs="B Nazanin"/>
+                <w:sz w:val="21"/>
+                <w:szCs w:val="21"/>
+                <w:rtl/>
+              </w:rPr>
+              <w:t>E5 &gt; BM25 &gt; SF</w:t>
+            </w:r>
+          </w:p>
+        </w:tc>
+      </w:tr>
+      <w:tr>
+        <w:tc>
+          <w:tcPr>
+            <w:tcW w:type="dxa" w:w="1378"/>
+          </w:tcPr>
+          <w:p>
+            <w:pPr>
+              <w:jc w:val="right"/>
+            </w:pPr>
+            <w:r/>
+            <w:r>
+              <w:rPr>
+                <w:rFonts w:ascii="Times New Roman" w:hAnsi="Times New Roman" w:cs="B Nazanin"/>
+                <w:sz w:val="21"/>
+                <w:szCs w:val="21"/>
+                <w:rtl/>
+              </w:rPr>
+              <w:t>14</w:t>
+            </w:r>
+          </w:p>
+        </w:tc>
+        <w:tc>
+          <w:tcPr>
+            <w:tcW w:type="dxa" w:w="1378"/>
+          </w:tcPr>
+          <w:p>
+            <w:pPr>
+              <w:jc w:val="center"/>
+            </w:pPr>
+            <w:r/>
+            <w:r>
+              <w:rPr>
+                <w:rFonts w:ascii="Times New Roman" w:hAnsi="Times New Roman" w:cs="B Nazanin"/>
+                <w:sz w:val="21"/>
+                <w:szCs w:val="21"/>
+                <w:rtl/>
+              </w:rPr>
+              <w:t>MIRACL-ar (200q, pool=100)</w:t>
+            </w:r>
+          </w:p>
+        </w:tc>
+        <w:tc>
+          <w:tcPr>
+            <w:tcW w:type="dxa" w:w="1378"/>
+          </w:tcPr>
+          <w:p>
+            <w:pPr>
+              <w:jc w:val="center"/>
+            </w:pPr>
+            <w:r/>
+            <w:r>
+              <w:rPr>
+                <w:rFonts w:ascii="Times New Roman" w:hAnsi="Times New Roman" w:cs="B Nazanin"/>
+                <w:sz w:val="21"/>
+                <w:szCs w:val="21"/>
+                <w:rtl/>
+              </w:rPr>
+              <w:t>Pure SF</w:t>
+            </w:r>
+          </w:p>
+        </w:tc>
+        <w:tc>
+          <w:tcPr>
+            <w:tcW w:type="dxa" w:w="1378"/>
+          </w:tcPr>
+          <w:p>
+            <w:pPr>
+              <w:jc w:val="center"/>
+            </w:pPr>
+            <w:r/>
+            <w:r>
+              <w:rPr>
+                <w:rFonts w:ascii="Times New Roman" w:hAnsi="Times New Roman" w:cs="B Nazanin"/>
+                <w:sz w:val="21"/>
+                <w:szCs w:val="21"/>
+                <w:rtl/>
+              </w:rPr>
+              <w:t>0.5420</w:t>
+            </w:r>
+          </w:p>
+        </w:tc>
+        <w:tc>
+          <w:tcPr>
+            <w:tcW w:type="dxa" w:w="1378"/>
+          </w:tcPr>
+          <w:p>
+            <w:pPr>
+              <w:jc w:val="center"/>
+            </w:pPr>
+            <w:r/>
+            <w:r>
+              <w:rPr>
+                <w:rFonts w:ascii="Times New Roman" w:hAnsi="Times New Roman" w:cs="B Nazanin"/>
+                <w:sz w:val="21"/>
+                <w:szCs w:val="21"/>
+                <w:rtl/>
+              </w:rPr>
+              <w:t>0.5420§</w:t>
+            </w:r>
+          </w:p>
+        </w:tc>
+        <w:tc>
+          <w:tcPr>
+            <w:tcW w:type="dxa" w:w="1378"/>
+          </w:tcPr>
+          <w:p>
+            <w:pPr>
+              <w:jc w:val="center"/>
+            </w:pPr>
+            <w:r/>
+            <w:r>
+              <w:rPr>
+                <w:rFonts w:ascii="Times New Roman" w:hAnsi="Times New Roman" w:cs="B Nazanin"/>
+                <w:sz w:val="21"/>
+                <w:szCs w:val="21"/>
+                <w:rtl/>
+              </w:rPr>
+              <w:t>0.8152 / 0.8152§</w:t>
+            </w:r>
+          </w:p>
+        </w:tc>
+        <w:tc>
+          <w:tcPr>
+            <w:tcW w:type="dxa" w:w="1378"/>
+          </w:tcPr>
+          <w:p>
+            <w:pPr>
+              <w:jc w:val="center"/>
+            </w:pPr>
+            <w:r/>
+            <w:r>
+              <w:rPr>
+                <w:rFonts w:ascii="Times New Roman" w:hAnsi="Times New Roman" w:cs="B Nazanin"/>
+                <w:sz w:val="21"/>
+                <w:szCs w:val="21"/>
+                <w:rtl/>
+              </w:rPr>
+              <w:t>E5 ≈ BM25 &gt; SF</w:t>
+            </w:r>
+          </w:p>
+        </w:tc>
+      </w:tr>
     </w:tbl>
     <w:p/>
     <w:p>
@@ -10364,7 +10914,7 @@
           <w:szCs w:val="24"/>
           <w:rtl/>
         </w:rPr>
-        <w:t>\* چندسند مرتبط؛ † RRF در SciDocs به AP=0.719 رسید اما کمتر از BM25 (0.731)؛ ‡ در NarrativeQA واریانت RRF نیز MRR=1.000 با AP=0.2996 به دست آورده است (بهترین AP خانوادهٔ SF).</w:t>
+        <w:t>\* چندسند مرتبط؛ † RRF در SciDocs به AP=0.719 رسید اما کمتر از BM25 (0.731)؛ ‡ در NarrativeQA واریانت RRF نیز MRR=1.000 با AP=0.2996 به دست آورده است (بهترین AP خانوادهٔ SF)؛ § تک‌سند مرتبط در استخر ۱۰۰تایی ⇒ AP≡MRR.</w:t>
       </w:r>
     </w:p>
     <w:p>
@@ -10517,6 +11067,431 @@
           <w:szCs w:val="21"/>
         </w:rPr>
         <w:t>outputs/cross_ar_benchmark/benchmarks/benchmark_20260729_115041/summary.json</w:t>
+      </w:r>
+      <w:r>
+        <w:rPr>
+          <w:rFonts w:ascii="Times New Roman" w:hAnsi="Times New Roman" w:cs="B Nazanin"/>
+          <w:sz w:val="24"/>
+          <w:szCs w:val="24"/>
+          <w:rtl/>
+        </w:rPr>
+        <w:t xml:space="preserve">. ردیف‌های ۱۳–۱۴: </w:t>
+      </w:r>
+      <w:r>
+        <w:rPr>
+          <w:rFonts w:ascii="Consolas" w:hAnsi="Consolas" w:cs="Consolas"/>
+          <w:sz w:val="21"/>
+          <w:szCs w:val="21"/>
+        </w:rPr>
+        <w:t>outputs/{mrtydi_ar,miracl_ar}_benchmark/pooled/summary.json</w:t>
+      </w:r>
+      <w:r>
+        <w:rPr>
+          <w:rFonts w:ascii="Times New Roman" w:hAnsi="Times New Roman" w:cs="B Nazanin"/>
+          <w:sz w:val="24"/>
+          <w:szCs w:val="24"/>
+          <w:rtl/>
+        </w:rPr>
+        <w:t>.</w:t>
+      </w:r>
+    </w:p>
+    <w:p>
+      <w:pPr>
+        <w:spacing w:before="200" w:after="120"/>
+        <w:jc w:val="right"/>
+        <w:bidi/>
+      </w:pPr>
+      <w:r>
+        <w:rPr>
+          <w:rFonts w:ascii="Times New Roman" w:hAnsi="Times New Roman" w:cs="B Nazanin"/>
+          <w:b/>
+          <w:color w:val="1F3B63"/>
+          <w:sz w:val="27"/>
+          <w:szCs w:val="27"/>
+          <w:rtl/>
+          <w:bCs/>
+        </w:rPr>
+        <w:t>۴-۴-۴. بنچمارک‌های چندزبانهٔ استاندارد (Mr.TyDi / MIRACL عربی)</w:t>
+      </w:r>
+    </w:p>
+    <w:p>
+      <w:pPr>
+        <w:jc w:val="right"/>
+        <w:bidi/>
+      </w:pPr>
+      <w:r>
+        <w:rPr>
+          <w:rFonts w:ascii="Times New Roman" w:hAnsi="Times New Roman" w:cs="B Nazanin"/>
+          <w:sz w:val="24"/>
+          <w:szCs w:val="24"/>
+          <w:rtl/>
+        </w:rPr>
+        <w:t>برای سنجش روش روی دو مجموعه‌دادهٔ چندزبانهٔ شناخته‌شده، زیرمجموعه‌های pooled-100 از بخش عربی Mr.TyDi v1.1 و MIRACL v1.0 ساخته شد: ۲۰۰ پرسش نخستِ dev (هر یک با سند مرتبط رسمی) + ۹۹ نگتیو نمونه‌گیری‌شده از کورپوس کامل (استخر مشترک ۵هزارتایی، seed=42)؛ نمایه‌سازی SF با method=tsne (+SVD پیش‌کاهنده به‌دلیل واژگان انفجاری عربی ویکی‌پدیا، min_freq=3 در MIRACL):</w:t>
+      </w:r>
+    </w:p>
+    <w:tbl>
+      <w:tblPr>
+        <w:tblStyle w:val="TableGrid"/>
+        <w:tblW w:type="auto" w:w="0"/>
+        <w:jc w:val="center"/>
+        <w:tblLook w:firstColumn="1" w:firstRow="1" w:lastColumn="0" w:lastRow="0" w:noHBand="0" w:noVBand="1" w:val="04A0"/>
+        <w:bidiVisual/>
+      </w:tblPr>
+      <w:tblGrid>
+        <w:gridCol w:w="3216"/>
+        <w:gridCol w:w="3216"/>
+        <w:gridCol w:w="3216"/>
+      </w:tblGrid>
+      <w:tr>
+        <w:tc>
+          <w:tcPr>
+            <w:tcW w:type="dxa" w:w="3216"/>
+          </w:tcPr>
+          <w:p>
+            <w:pPr>
+              <w:jc w:val="center"/>
+            </w:pPr>
+            <w:r>
+              <w:rPr>
+                <w:b/>
+              </w:rPr>
+            </w:r>
+            <w:r>
+              <w:rPr>
+                <w:rFonts w:ascii="Times New Roman" w:hAnsi="Times New Roman" w:cs="B Nazanin"/>
+                <w:b/>
+                <w:sz w:val="21"/>
+                <w:szCs w:val="21"/>
+                <w:rtl/>
+              </w:rPr>
+              <w:t>روش</w:t>
+            </w:r>
+          </w:p>
+        </w:tc>
+        <w:tc>
+          <w:tcPr>
+            <w:tcW w:type="dxa" w:w="3216"/>
+          </w:tcPr>
+          <w:p>
+            <w:pPr>
+              <w:jc w:val="center"/>
+            </w:pPr>
+            <w:r>
+              <w:rPr>
+                <w:b/>
+              </w:rPr>
+            </w:r>
+            <w:r>
+              <w:rPr>
+                <w:rFonts w:ascii="Times New Roman" w:hAnsi="Times New Roman" w:cs="B Nazanin"/>
+                <w:b/>
+                <w:sz w:val="21"/>
+                <w:szCs w:val="21"/>
+                <w:rtl/>
+              </w:rPr>
+              <w:t>TyDi-ar MRR</w:t>
+            </w:r>
+          </w:p>
+        </w:tc>
+        <w:tc>
+          <w:tcPr>
+            <w:tcW w:type="dxa" w:w="3216"/>
+          </w:tcPr>
+          <w:p>
+            <w:pPr>
+              <w:jc w:val="center"/>
+            </w:pPr>
+            <w:r>
+              <w:rPr>
+                <w:b/>
+              </w:rPr>
+            </w:r>
+            <w:r>
+              <w:rPr>
+                <w:rFonts w:ascii="Times New Roman" w:hAnsi="Times New Roman" w:cs="B Nazanin"/>
+                <w:b/>
+                <w:sz w:val="21"/>
+                <w:szCs w:val="21"/>
+                <w:rtl/>
+              </w:rPr>
+              <w:t>MIRACL-ar MRR</w:t>
+            </w:r>
+          </w:p>
+        </w:tc>
+      </w:tr>
+      <w:tr>
+        <w:tc>
+          <w:tcPr>
+            <w:tcW w:type="dxa" w:w="3216"/>
+          </w:tcPr>
+          <w:p>
+            <w:pPr>
+              <w:jc w:val="right"/>
+            </w:pPr>
+            <w:r/>
+            <w:r>
+              <w:rPr>
+                <w:b/>
+                <w:rFonts w:ascii="Times New Roman" w:hAnsi="Times New Roman" w:cs="B Nazanin"/>
+                <w:sz w:val="21"/>
+                <w:szCs w:val="21"/>
+                <w:rtl/>
+              </w:rPr>
+              <w:t>E5-multilingual</w:t>
+            </w:r>
+          </w:p>
+        </w:tc>
+        <w:tc>
+          <w:tcPr>
+            <w:tcW w:type="dxa" w:w="3216"/>
+          </w:tcPr>
+          <w:p>
+            <w:pPr>
+              <w:jc w:val="center"/>
+            </w:pPr>
+            <w:r/>
+            <w:r>
+              <w:rPr>
+                <w:b/>
+                <w:rFonts w:ascii="Times New Roman" w:hAnsi="Times New Roman" w:cs="B Nazanin"/>
+                <w:sz w:val="21"/>
+                <w:szCs w:val="21"/>
+                <w:rtl/>
+              </w:rPr>
+              <w:t>0.989</w:t>
+            </w:r>
+          </w:p>
+        </w:tc>
+        <w:tc>
+          <w:tcPr>
+            <w:tcW w:type="dxa" w:w="3216"/>
+          </w:tcPr>
+          <w:p>
+            <w:pPr>
+              <w:jc w:val="center"/>
+            </w:pPr>
+            <w:r/>
+            <w:r>
+              <w:rPr>
+                <w:b/>
+                <w:rFonts w:ascii="Times New Roman" w:hAnsi="Times New Roman" w:cs="B Nazanin"/>
+                <w:sz w:val="21"/>
+                <w:szCs w:val="21"/>
+                <w:rtl/>
+              </w:rPr>
+              <w:t>0.860</w:t>
+            </w:r>
+          </w:p>
+        </w:tc>
+      </w:tr>
+      <w:tr>
+        <w:tc>
+          <w:tcPr>
+            <w:tcW w:type="dxa" w:w="3216"/>
+          </w:tcPr>
+          <w:p>
+            <w:pPr>
+              <w:jc w:val="right"/>
+            </w:pPr>
+            <w:r/>
+            <w:r>
+              <w:rPr>
+                <w:rFonts w:ascii="Times New Roman" w:hAnsi="Times New Roman" w:cs="B Nazanin"/>
+                <w:sz w:val="21"/>
+                <w:szCs w:val="21"/>
+                <w:rtl/>
+              </w:rPr>
+              <w:t>BM25</w:t>
+            </w:r>
+          </w:p>
+        </w:tc>
+        <w:tc>
+          <w:tcPr>
+            <w:tcW w:type="dxa" w:w="3216"/>
+          </w:tcPr>
+          <w:p>
+            <w:pPr>
+              <w:jc w:val="center"/>
+            </w:pPr>
+            <w:r/>
+            <w:r>
+              <w:rPr>
+                <w:rFonts w:ascii="Times New Roman" w:hAnsi="Times New Roman" w:cs="B Nazanin"/>
+                <w:sz w:val="21"/>
+                <w:szCs w:val="21"/>
+                <w:rtl/>
+              </w:rPr>
+              <w:t>0.881</w:t>
+            </w:r>
+          </w:p>
+        </w:tc>
+        <w:tc>
+          <w:tcPr>
+            <w:tcW w:type="dxa" w:w="3216"/>
+          </w:tcPr>
+          <w:p>
+            <w:pPr>
+              <w:jc w:val="center"/>
+            </w:pPr>
+            <w:r/>
+            <w:r>
+              <w:rPr>
+                <w:rFonts w:ascii="Times New Roman" w:hAnsi="Times New Roman" w:cs="B Nazanin"/>
+                <w:sz w:val="21"/>
+                <w:szCs w:val="21"/>
+                <w:rtl/>
+              </w:rPr>
+              <w:t>0.815</w:t>
+            </w:r>
+          </w:p>
+        </w:tc>
+      </w:tr>
+      <w:tr>
+        <w:tc>
+          <w:tcPr>
+            <w:tcW w:type="dxa" w:w="3216"/>
+          </w:tcPr>
+          <w:p>
+            <w:pPr>
+              <w:jc w:val="right"/>
+            </w:pPr>
+            <w:r/>
+            <w:r>
+              <w:rPr>
+                <w:rFonts w:ascii="Times New Roman" w:hAnsi="Times New Roman" w:cs="B Nazanin"/>
+                <w:sz w:val="21"/>
+                <w:szCs w:val="21"/>
+                <w:rtl/>
+              </w:rPr>
+              <w:t>Pure SF</w:t>
+            </w:r>
+          </w:p>
+        </w:tc>
+        <w:tc>
+          <w:tcPr>
+            <w:tcW w:type="dxa" w:w="3216"/>
+          </w:tcPr>
+          <w:p>
+            <w:pPr>
+              <w:jc w:val="center"/>
+            </w:pPr>
+            <w:r/>
+            <w:r>
+              <w:rPr>
+                <w:rFonts w:ascii="Times New Roman" w:hAnsi="Times New Roman" w:cs="B Nazanin"/>
+                <w:sz w:val="21"/>
+                <w:szCs w:val="21"/>
+                <w:rtl/>
+              </w:rPr>
+              <w:t>0.544</w:t>
+            </w:r>
+          </w:p>
+        </w:tc>
+        <w:tc>
+          <w:tcPr>
+            <w:tcW w:type="dxa" w:w="3216"/>
+          </w:tcPr>
+          <w:p>
+            <w:pPr>
+              <w:jc w:val="center"/>
+            </w:pPr>
+            <w:r/>
+            <w:r>
+              <w:rPr>
+                <w:rFonts w:ascii="Times New Roman" w:hAnsi="Times New Roman" w:cs="B Nazanin"/>
+                <w:sz w:val="21"/>
+                <w:szCs w:val="21"/>
+                <w:rtl/>
+              </w:rPr>
+              <w:t>0.542</w:t>
+            </w:r>
+          </w:p>
+        </w:tc>
+      </w:tr>
+    </w:tbl>
+    <w:p/>
+    <w:p>
+      <w:pPr>
+        <w:jc w:val="right"/>
+        <w:bidi/>
+      </w:pPr>
+      <w:r>
+        <w:rPr>
+          <w:rFonts w:ascii="Times New Roman" w:hAnsi="Times New Roman" w:cs="B Nazanin"/>
+          <w:sz w:val="24"/>
+          <w:szCs w:val="24"/>
+          <w:rtl/>
+        </w:rPr>
+        <w:t>معناداری: در هر دو مجموعه SF به‌طور معنادار از BM25 ضعیف‌تر است (p&lt;1e-11)؛ برتری E5 بر BM25 در TyDI شدید (p&lt;1e-5) و در MIRACL مرزی (p=0.056).</w:t>
+      </w:r>
+    </w:p>
+    <w:p>
+      <w:pPr>
+        <w:jc w:val="right"/>
+        <w:bidi/>
+      </w:pPr>
+      <w:r>
+        <w:rPr>
+          <w:b/>
+          <w:rFonts w:ascii="Times New Roman" w:hAnsi="Times New Roman" w:cs="B Nazanin"/>
+          <w:sz w:val="24"/>
+          <w:szCs w:val="24"/>
+          <w:rtl/>
+        </w:rPr>
+        <w:t>تفسیر:</w:t>
+      </w:r>
+      <w:r>
+        <w:rPr>
+          <w:rFonts w:ascii="Times New Roman" w:hAnsi="Times New Roman" w:cs="B Nazanin"/>
+          <w:sz w:val="24"/>
+          <w:szCs w:val="24"/>
+          <w:rtl/>
+        </w:rPr>
+        <w:t xml:space="preserve"> این نتیجه مرز کاربرد روش را شفاف می‌کند — روی قطعات دانشنامه‌ای بازدامنه با تنوع واژگانی عربی بالا، توپولوژی 64×64 ظرفیت تفکیک کافی ندارد و مدل‌های تراکمی چندزبانه غالب‌اند؛ برتری مستند SF در فصل حاضر به </w:t>
+      </w:r>
+      <w:r>
+        <w:rPr>
+          <w:b/>
+          <w:rFonts w:ascii="Times New Roman" w:hAnsi="Times New Roman" w:cs="B Nazanin"/>
+          <w:sz w:val="24"/>
+          <w:szCs w:val="24"/>
+          <w:rtl/>
+        </w:rPr>
+        <w:t>دامنه‌های بستهٔ تخصصی</w:t>
+      </w:r>
+      <w:r>
+        <w:rPr>
+          <w:rFonts w:ascii="Times New Roman" w:hAnsi="Times New Roman" w:cs="B Nazanin"/>
+          <w:sz w:val="24"/>
+          <w:szCs w:val="24"/>
+          <w:rtl/>
+        </w:rPr>
+        <w:t xml:space="preserve"> (قرآن، پیکرهٔ دوزبانهٔ دینی، SciFact) تعلق دارد. منبع: </w:t>
+      </w:r>
+      <w:r>
+        <w:rPr>
+          <w:rFonts w:ascii="Consolas" w:hAnsi="Consolas" w:cs="Consolas"/>
+          <w:sz w:val="21"/>
+          <w:szCs w:val="21"/>
+        </w:rPr>
+        <w:t>scripts/build_pooled_multilingual.py</w:t>
+      </w:r>
+      <w:r>
+        <w:rPr>
+          <w:rFonts w:ascii="Times New Roman" w:hAnsi="Times New Roman" w:cs="B Nazanin"/>
+          <w:sz w:val="24"/>
+          <w:szCs w:val="24"/>
+          <w:rtl/>
+        </w:rPr>
+        <w:t xml:space="preserve"> و </w:t>
+      </w:r>
+      <w:r>
+        <w:rPr>
+          <w:rFonts w:ascii="Consolas" w:hAnsi="Consolas" w:cs="Consolas"/>
+          <w:sz w:val="21"/>
+          <w:szCs w:val="21"/>
+        </w:rPr>
+        <w:t>scripts/bench_pooled.py</w:t>
       </w:r>
       <w:r>
         <w:rPr>
@@ -10579,7 +11554,7 @@
           <w:szCs w:val="21"/>
           <w:rtl/>
         </w:rPr>
-        <w:t>مقایسهٔ بهترین SF با BM25 روی ۱۱ بنچمارک</w:t>
+        <w:t>مقایسهٔ بهترین SF با BM25 روی ۱۳ بنچمارک</w:t>
       </w:r>
     </w:p>
     <w:p>
@@ -14874,6 +15849,1094 @@
     </w:p>
     <w:p>
       <w:pPr>
+        <w:jc w:val="right"/>
+        <w:bidi/>
+      </w:pPr>
+      <w:r>
+        <w:rPr>
+          <w:b/>
+          <w:rFonts w:ascii="Times New Roman" w:hAnsi="Times New Roman" w:cs="B Nazanin"/>
+          <w:sz w:val="24"/>
+          <w:szCs w:val="24"/>
+          <w:rtl/>
+        </w:rPr>
+        <w:t>گسترش به همهٔ دیتاست‌ها (E5-multilingual):</w:t>
+      </w:r>
+      <w:r>
+        <w:rPr>
+          <w:rFonts w:ascii="Times New Roman" w:hAnsi="Times New Roman" w:cs="B Nazanin"/>
+          <w:sz w:val="24"/>
+          <w:szCs w:val="24"/>
+          <w:rtl/>
+        </w:rPr>
+        <w:t xml:space="preserve"> با همان پروتکل، مدل </w:t>
+      </w:r>
+      <w:r>
+        <w:rPr>
+          <w:rFonts w:ascii="Consolas" w:hAnsi="Consolas" w:cs="Consolas"/>
+          <w:sz w:val="21"/>
+          <w:szCs w:val="21"/>
+        </w:rPr>
+        <w:t>multilingual-e5-small</w:t>
+      </w:r>
+      <w:r>
+        <w:rPr>
+          <w:rFonts w:ascii="Times New Roman" w:hAnsi="Times New Roman" w:cs="B Nazanin"/>
+          <w:sz w:val="24"/>
+          <w:szCs w:val="24"/>
+          <w:rtl/>
+        </w:rPr>
+        <w:t xml:space="preserve"> روی هر ۸ مجموعهٔ موجود + ۲ مجموعهٔ جدید اجرا شد:</w:t>
+      </w:r>
+    </w:p>
+    <w:p>
+      <w:pPr>
+        <w:jc w:val="right"/>
+        <w:bidi/>
+      </w:pPr>
+      <w:r>
+        <w:rPr>
+          <w:b/>
+          <w:rFonts w:ascii="Times New Roman" w:hAnsi="Times New Roman" w:cs="B Nazanin"/>
+          <w:sz w:val="24"/>
+          <w:szCs w:val="24"/>
+          <w:rtl/>
+        </w:rPr>
+        <w:t>جدول ۴-۸.</w:t>
+      </w:r>
+      <w:r>
+        <w:rPr>
+          <w:rFonts w:ascii="Times New Roman" w:hAnsi="Times New Roman" w:cs="B Nazanin"/>
+          <w:sz w:val="24"/>
+          <w:szCs w:val="24"/>
+          <w:rtl/>
+        </w:rPr>
+        <w:t xml:space="preserve"> MRR خط مبنای تراکمی E5 در مقایسه با بهترین SF و BM25.</w:t>
+      </w:r>
+    </w:p>
+    <w:tbl>
+      <w:tblPr>
+        <w:tblStyle w:val="TableGrid"/>
+        <w:tblW w:type="auto" w:w="0"/>
+        <w:jc w:val="center"/>
+        <w:tblLook w:firstColumn="1" w:firstRow="1" w:lastColumn="0" w:lastRow="0" w:noHBand="0" w:noVBand="1" w:val="04A0"/>
+        <w:bidiVisual/>
+      </w:tblPr>
+      <w:tblGrid>
+        <w:gridCol w:w="2412"/>
+        <w:gridCol w:w="2412"/>
+        <w:gridCol w:w="2412"/>
+        <w:gridCol w:w="2412"/>
+      </w:tblGrid>
+      <w:tr>
+        <w:tc>
+          <w:tcPr>
+            <w:tcW w:type="dxa" w:w="2412"/>
+          </w:tcPr>
+          <w:p>
+            <w:pPr>
+              <w:jc w:val="center"/>
+            </w:pPr>
+            <w:r>
+              <w:rPr>
+                <w:b/>
+              </w:rPr>
+            </w:r>
+            <w:r>
+              <w:rPr>
+                <w:rFonts w:ascii="Times New Roman" w:hAnsi="Times New Roman" w:cs="B Nazanin"/>
+                <w:b/>
+                <w:sz w:val="21"/>
+                <w:szCs w:val="21"/>
+                <w:rtl/>
+              </w:rPr>
+              <w:t>مجموعه‌داده</w:t>
+            </w:r>
+          </w:p>
+        </w:tc>
+        <w:tc>
+          <w:tcPr>
+            <w:tcW w:type="dxa" w:w="2412"/>
+          </w:tcPr>
+          <w:p>
+            <w:pPr>
+              <w:jc w:val="center"/>
+            </w:pPr>
+            <w:r>
+              <w:rPr>
+                <w:b/>
+              </w:rPr>
+            </w:r>
+            <w:r>
+              <w:rPr>
+                <w:rFonts w:ascii="Times New Roman" w:hAnsi="Times New Roman" w:cs="B Nazanin"/>
+                <w:b/>
+                <w:sz w:val="21"/>
+                <w:szCs w:val="21"/>
+                <w:rtl/>
+              </w:rPr>
+              <w:t>Best SF</w:t>
+            </w:r>
+          </w:p>
+        </w:tc>
+        <w:tc>
+          <w:tcPr>
+            <w:tcW w:type="dxa" w:w="2412"/>
+          </w:tcPr>
+          <w:p>
+            <w:pPr>
+              <w:jc w:val="center"/>
+            </w:pPr>
+            <w:r>
+              <w:rPr>
+                <w:b/>
+              </w:rPr>
+            </w:r>
+            <w:r>
+              <w:rPr>
+                <w:rFonts w:ascii="Times New Roman" w:hAnsi="Times New Roman" w:cs="B Nazanin"/>
+                <w:b/>
+                <w:sz w:val="21"/>
+                <w:szCs w:val="21"/>
+                <w:rtl/>
+              </w:rPr>
+              <w:t>BM25</w:t>
+            </w:r>
+          </w:p>
+        </w:tc>
+        <w:tc>
+          <w:tcPr>
+            <w:tcW w:type="dxa" w:w="2412"/>
+          </w:tcPr>
+          <w:p>
+            <w:pPr>
+              <w:jc w:val="center"/>
+            </w:pPr>
+            <w:r>
+              <w:rPr>
+                <w:b/>
+              </w:rPr>
+            </w:r>
+            <w:r>
+              <w:rPr>
+                <w:b/>
+                <w:rFonts w:ascii="Times New Roman" w:hAnsi="Times New Roman" w:cs="B Nazanin"/>
+                <w:sz w:val="21"/>
+                <w:szCs w:val="21"/>
+                <w:rtl/>
+              </w:rPr>
+              <w:t>E5-multi</w:t>
+            </w:r>
+          </w:p>
+        </w:tc>
+      </w:tr>
+      <w:tr>
+        <w:tc>
+          <w:tcPr>
+            <w:tcW w:type="dxa" w:w="2412"/>
+          </w:tcPr>
+          <w:p>
+            <w:pPr>
+              <w:jc w:val="right"/>
+            </w:pPr>
+            <w:r/>
+            <w:r>
+              <w:rPr>
+                <w:rFonts w:ascii="Times New Roman" w:hAnsi="Times New Roman" w:cs="B Nazanin"/>
+                <w:sz w:val="21"/>
+                <w:szCs w:val="21"/>
+                <w:rtl/>
+              </w:rPr>
+              <w:t>SciFact</w:t>
+            </w:r>
+          </w:p>
+        </w:tc>
+        <w:tc>
+          <w:tcPr>
+            <w:tcW w:type="dxa" w:w="2412"/>
+          </w:tcPr>
+          <w:p>
+            <w:pPr>
+              <w:jc w:val="center"/>
+            </w:pPr>
+            <w:r/>
+            <w:r>
+              <w:rPr>
+                <w:b/>
+                <w:rFonts w:ascii="Times New Roman" w:hAnsi="Times New Roman" w:cs="B Nazanin"/>
+                <w:sz w:val="21"/>
+                <w:szCs w:val="21"/>
+                <w:rtl/>
+              </w:rPr>
+              <w:t>0.966</w:t>
+            </w:r>
+          </w:p>
+        </w:tc>
+        <w:tc>
+          <w:tcPr>
+            <w:tcW w:type="dxa" w:w="2412"/>
+          </w:tcPr>
+          <w:p>
+            <w:pPr>
+              <w:jc w:val="center"/>
+            </w:pPr>
+            <w:r/>
+            <w:r>
+              <w:rPr>
+                <w:rFonts w:ascii="Times New Roman" w:hAnsi="Times New Roman" w:cs="B Nazanin"/>
+                <w:sz w:val="21"/>
+                <w:szCs w:val="21"/>
+                <w:rtl/>
+              </w:rPr>
+              <w:t>0.947</w:t>
+            </w:r>
+          </w:p>
+        </w:tc>
+        <w:tc>
+          <w:tcPr>
+            <w:tcW w:type="dxa" w:w="2412"/>
+          </w:tcPr>
+          <w:p>
+            <w:pPr>
+              <w:jc w:val="center"/>
+            </w:pPr>
+            <w:r/>
+            <w:r>
+              <w:rPr>
+                <w:rFonts w:ascii="Times New Roman" w:hAnsi="Times New Roman" w:cs="B Nazanin"/>
+                <w:sz w:val="21"/>
+                <w:szCs w:val="21"/>
+                <w:rtl/>
+              </w:rPr>
+              <w:t>0.865</w:t>
+            </w:r>
+          </w:p>
+        </w:tc>
+      </w:tr>
+      <w:tr>
+        <w:tc>
+          <w:tcPr>
+            <w:tcW w:type="dxa" w:w="2412"/>
+          </w:tcPr>
+          <w:p>
+            <w:pPr>
+              <w:jc w:val="right"/>
+            </w:pPr>
+            <w:r/>
+            <w:r>
+              <w:rPr>
+                <w:rFonts w:ascii="Times New Roman" w:hAnsi="Times New Roman" w:cs="B Nazanin"/>
+                <w:sz w:val="21"/>
+                <w:szCs w:val="21"/>
+                <w:rtl/>
+              </w:rPr>
+              <w:t>nfcorpus</w:t>
+            </w:r>
+          </w:p>
+        </w:tc>
+        <w:tc>
+          <w:tcPr>
+            <w:tcW w:type="dxa" w:w="2412"/>
+          </w:tcPr>
+          <w:p>
+            <w:pPr>
+              <w:jc w:val="center"/>
+            </w:pPr>
+            <w:r/>
+            <w:r>
+              <w:rPr>
+                <w:rFonts w:ascii="Times New Roman" w:hAnsi="Times New Roman" w:cs="B Nazanin"/>
+                <w:sz w:val="21"/>
+                <w:szCs w:val="21"/>
+                <w:rtl/>
+              </w:rPr>
+              <w:t>0.655</w:t>
+            </w:r>
+          </w:p>
+        </w:tc>
+        <w:tc>
+          <w:tcPr>
+            <w:tcW w:type="dxa" w:w="2412"/>
+          </w:tcPr>
+          <w:p>
+            <w:pPr>
+              <w:jc w:val="center"/>
+            </w:pPr>
+            <w:r/>
+            <w:r>
+              <w:rPr>
+                <w:b/>
+                <w:rFonts w:ascii="Times New Roman" w:hAnsi="Times New Roman" w:cs="B Nazanin"/>
+                <w:sz w:val="21"/>
+                <w:szCs w:val="21"/>
+                <w:rtl/>
+              </w:rPr>
+              <w:t>0.686</w:t>
+            </w:r>
+          </w:p>
+        </w:tc>
+        <w:tc>
+          <w:tcPr>
+            <w:tcW w:type="dxa" w:w="2412"/>
+          </w:tcPr>
+          <w:p>
+            <w:pPr>
+              <w:jc w:val="center"/>
+            </w:pPr>
+            <w:r/>
+            <w:r>
+              <w:rPr>
+                <w:rFonts w:ascii="Times New Roman" w:hAnsi="Times New Roman" w:cs="B Nazanin"/>
+                <w:sz w:val="21"/>
+                <w:szCs w:val="21"/>
+                <w:rtl/>
+              </w:rPr>
+              <w:t>0.405</w:t>
+            </w:r>
+          </w:p>
+        </w:tc>
+      </w:tr>
+      <w:tr>
+        <w:tc>
+          <w:tcPr>
+            <w:tcW w:type="dxa" w:w="2412"/>
+          </w:tcPr>
+          <w:p>
+            <w:pPr>
+              <w:jc w:val="right"/>
+            </w:pPr>
+            <w:r/>
+            <w:r>
+              <w:rPr>
+                <w:rFonts w:ascii="Times New Roman" w:hAnsi="Times New Roman" w:cs="B Nazanin"/>
+                <w:sz w:val="21"/>
+                <w:szCs w:val="21"/>
+                <w:rtl/>
+              </w:rPr>
+              <w:t>Belebele</w:t>
+            </w:r>
+          </w:p>
+        </w:tc>
+        <w:tc>
+          <w:tcPr>
+            <w:tcW w:type="dxa" w:w="2412"/>
+          </w:tcPr>
+          <w:p>
+            <w:pPr>
+              <w:jc w:val="center"/>
+            </w:pPr>
+            <w:r/>
+            <w:r>
+              <w:rPr>
+                <w:b/>
+                <w:rFonts w:ascii="Times New Roman" w:hAnsi="Times New Roman" w:cs="B Nazanin"/>
+                <w:sz w:val="21"/>
+                <w:szCs w:val="21"/>
+                <w:rtl/>
+              </w:rPr>
+              <w:t>1.000</w:t>
+            </w:r>
+          </w:p>
+        </w:tc>
+        <w:tc>
+          <w:tcPr>
+            <w:tcW w:type="dxa" w:w="2412"/>
+          </w:tcPr>
+          <w:p>
+            <w:pPr>
+              <w:jc w:val="center"/>
+            </w:pPr>
+            <w:r/>
+            <w:r>
+              <w:rPr>
+                <w:rFonts w:ascii="Times New Roman" w:hAnsi="Times New Roman" w:cs="B Nazanin"/>
+                <w:sz w:val="21"/>
+                <w:szCs w:val="21"/>
+                <w:rtl/>
+              </w:rPr>
+              <w:t>0.995</w:t>
+            </w:r>
+          </w:p>
+        </w:tc>
+        <w:tc>
+          <w:tcPr>
+            <w:tcW w:type="dxa" w:w="2412"/>
+          </w:tcPr>
+          <w:p>
+            <w:pPr>
+              <w:jc w:val="center"/>
+            </w:pPr>
+            <w:r/>
+            <w:r>
+              <w:rPr>
+                <w:rFonts w:ascii="Times New Roman" w:hAnsi="Times New Roman" w:cs="B Nazanin"/>
+                <w:sz w:val="21"/>
+                <w:szCs w:val="21"/>
+                <w:rtl/>
+              </w:rPr>
+              <w:t>0.971</w:t>
+            </w:r>
+          </w:p>
+        </w:tc>
+      </w:tr>
+      <w:tr>
+        <w:tc>
+          <w:tcPr>
+            <w:tcW w:type="dxa" w:w="2412"/>
+          </w:tcPr>
+          <w:p>
+            <w:pPr>
+              <w:jc w:val="right"/>
+            </w:pPr>
+            <w:r/>
+            <w:r>
+              <w:rPr>
+                <w:rFonts w:ascii="Times New Roman" w:hAnsi="Times New Roman" w:cs="B Nazanin"/>
+                <w:sz w:val="21"/>
+                <w:szCs w:val="21"/>
+                <w:rtl/>
+              </w:rPr>
+              <w:t>PubMedQA</w:t>
+            </w:r>
+          </w:p>
+        </w:tc>
+        <w:tc>
+          <w:tcPr>
+            <w:tcW w:type="dxa" w:w="2412"/>
+          </w:tcPr>
+          <w:p>
+            <w:pPr>
+              <w:jc w:val="center"/>
+            </w:pPr>
+            <w:r/>
+            <w:r>
+              <w:rPr>
+                <w:rFonts w:ascii="Times New Roman" w:hAnsi="Times New Roman" w:cs="B Nazanin"/>
+                <w:sz w:val="21"/>
+                <w:szCs w:val="21"/>
+                <w:rtl/>
+              </w:rPr>
+              <w:t>1.000</w:t>
+            </w:r>
+          </w:p>
+        </w:tc>
+        <w:tc>
+          <w:tcPr>
+            <w:tcW w:type="dxa" w:w="2412"/>
+          </w:tcPr>
+          <w:p>
+            <w:pPr>
+              <w:jc w:val="center"/>
+            </w:pPr>
+            <w:r/>
+            <w:r>
+              <w:rPr>
+                <w:rFonts w:ascii="Times New Roman" w:hAnsi="Times New Roman" w:cs="B Nazanin"/>
+                <w:sz w:val="21"/>
+                <w:szCs w:val="21"/>
+                <w:rtl/>
+              </w:rPr>
+              <w:t>1.000</w:t>
+            </w:r>
+          </w:p>
+        </w:tc>
+        <w:tc>
+          <w:tcPr>
+            <w:tcW w:type="dxa" w:w="2412"/>
+          </w:tcPr>
+          <w:p>
+            <w:pPr>
+              <w:jc w:val="center"/>
+            </w:pPr>
+            <w:r/>
+            <w:r>
+              <w:rPr>
+                <w:rFonts w:ascii="Times New Roman" w:hAnsi="Times New Roman" w:cs="B Nazanin"/>
+                <w:sz w:val="21"/>
+                <w:szCs w:val="21"/>
+                <w:rtl/>
+              </w:rPr>
+              <w:t>0.981</w:t>
+            </w:r>
+          </w:p>
+        </w:tc>
+      </w:tr>
+      <w:tr>
+        <w:tc>
+          <w:tcPr>
+            <w:tcW w:type="dxa" w:w="2412"/>
+          </w:tcPr>
+          <w:p>
+            <w:pPr>
+              <w:jc w:val="right"/>
+            </w:pPr>
+            <w:r/>
+            <w:r>
+              <w:rPr>
+                <w:rFonts w:ascii="Times New Roman" w:hAnsi="Times New Roman" w:cs="B Nazanin"/>
+                <w:sz w:val="21"/>
+                <w:szCs w:val="21"/>
+                <w:rtl/>
+              </w:rPr>
+              <w:t>PopQA(500)</w:t>
+            </w:r>
+          </w:p>
+        </w:tc>
+        <w:tc>
+          <w:tcPr>
+            <w:tcW w:type="dxa" w:w="2412"/>
+          </w:tcPr>
+          <w:p>
+            <w:pPr>
+              <w:jc w:val="center"/>
+            </w:pPr>
+            <w:r/>
+            <w:r>
+              <w:rPr>
+                <w:rFonts w:ascii="Times New Roman" w:hAnsi="Times New Roman" w:cs="B Nazanin"/>
+                <w:sz w:val="21"/>
+                <w:szCs w:val="21"/>
+                <w:rtl/>
+              </w:rPr>
+              <w:t>0.990</w:t>
+            </w:r>
+          </w:p>
+        </w:tc>
+        <w:tc>
+          <w:tcPr>
+            <w:tcW w:type="dxa" w:w="2412"/>
+          </w:tcPr>
+          <w:p>
+            <w:pPr>
+              <w:jc w:val="center"/>
+            </w:pPr>
+            <w:r/>
+            <w:r>
+              <w:rPr>
+                <w:rFonts w:ascii="Times New Roman" w:hAnsi="Times New Roman" w:cs="B Nazanin"/>
+                <w:sz w:val="21"/>
+                <w:szCs w:val="21"/>
+                <w:rtl/>
+              </w:rPr>
+              <w:t>1.000</w:t>
+            </w:r>
+          </w:p>
+        </w:tc>
+        <w:tc>
+          <w:tcPr>
+            <w:tcW w:type="dxa" w:w="2412"/>
+          </w:tcPr>
+          <w:p>
+            <w:pPr>
+              <w:jc w:val="center"/>
+            </w:pPr>
+            <w:r/>
+            <w:r>
+              <w:rPr>
+                <w:b/>
+                <w:rFonts w:ascii="Times New Roman" w:hAnsi="Times New Roman" w:cs="B Nazanin"/>
+                <w:sz w:val="21"/>
+                <w:szCs w:val="21"/>
+                <w:rtl/>
+              </w:rPr>
+              <w:t>0.996</w:t>
+            </w:r>
+          </w:p>
+        </w:tc>
+      </w:tr>
+      <w:tr>
+        <w:tc>
+          <w:tcPr>
+            <w:tcW w:type="dxa" w:w="2412"/>
+          </w:tcPr>
+          <w:p>
+            <w:pPr>
+              <w:jc w:val="right"/>
+            </w:pPr>
+            <w:r/>
+            <w:r>
+              <w:rPr>
+                <w:rFonts w:ascii="Times New Roman" w:hAnsi="Times New Roman" w:cs="B Nazanin"/>
+                <w:sz w:val="21"/>
+                <w:szCs w:val="21"/>
+                <w:rtl/>
+              </w:rPr>
+              <w:t>MuSiQue</w:t>
+            </w:r>
+          </w:p>
+        </w:tc>
+        <w:tc>
+          <w:tcPr>
+            <w:tcW w:type="dxa" w:w="2412"/>
+          </w:tcPr>
+          <w:p>
+            <w:pPr>
+              <w:jc w:val="center"/>
+            </w:pPr>
+            <w:r/>
+            <w:r>
+              <w:rPr>
+                <w:rFonts w:ascii="Times New Roman" w:hAnsi="Times New Roman" w:cs="B Nazanin"/>
+                <w:sz w:val="21"/>
+                <w:szCs w:val="21"/>
+                <w:rtl/>
+              </w:rPr>
+              <w:t>0.507</w:t>
+            </w:r>
+          </w:p>
+        </w:tc>
+        <w:tc>
+          <w:tcPr>
+            <w:tcW w:type="dxa" w:w="2412"/>
+          </w:tcPr>
+          <w:p>
+            <w:pPr>
+              <w:jc w:val="center"/>
+            </w:pPr>
+            <w:r/>
+            <w:r>
+              <w:rPr>
+                <w:b/>
+                <w:rFonts w:ascii="Times New Roman" w:hAnsi="Times New Roman" w:cs="B Nazanin"/>
+                <w:sz w:val="21"/>
+                <w:szCs w:val="21"/>
+                <w:rtl/>
+              </w:rPr>
+              <w:t>0.622</w:t>
+            </w:r>
+          </w:p>
+        </w:tc>
+        <w:tc>
+          <w:tcPr>
+            <w:tcW w:type="dxa" w:w="2412"/>
+          </w:tcPr>
+          <w:p>
+            <w:pPr>
+              <w:jc w:val="center"/>
+            </w:pPr>
+            <w:r/>
+            <w:r>
+              <w:rPr>
+                <w:rFonts w:ascii="Times New Roman" w:hAnsi="Times New Roman" w:cs="B Nazanin"/>
+                <w:sz w:val="21"/>
+                <w:szCs w:val="21"/>
+                <w:rtl/>
+              </w:rPr>
+              <w:t>0.520</w:t>
+            </w:r>
+          </w:p>
+        </w:tc>
+      </w:tr>
+      <w:tr>
+        <w:tc>
+          <w:tcPr>
+            <w:tcW w:type="dxa" w:w="2412"/>
+          </w:tcPr>
+          <w:p>
+            <w:pPr>
+              <w:jc w:val="right"/>
+            </w:pPr>
+            <w:r/>
+            <w:r>
+              <w:rPr>
+                <w:rFonts w:ascii="Times New Roman" w:hAnsi="Times New Roman" w:cs="B Nazanin"/>
+                <w:sz w:val="21"/>
+                <w:szCs w:val="21"/>
+                <w:rtl/>
+              </w:rPr>
+              <w:t>AR-EN(488)</w:t>
+            </w:r>
+          </w:p>
+        </w:tc>
+        <w:tc>
+          <w:tcPr>
+            <w:tcW w:type="dxa" w:w="2412"/>
+          </w:tcPr>
+          <w:p>
+            <w:pPr>
+              <w:jc w:val="center"/>
+            </w:pPr>
+            <w:r/>
+            <w:r>
+              <w:rPr>
+                <w:b/>
+                <w:rFonts w:ascii="Times New Roman" w:hAnsi="Times New Roman" w:cs="B Nazanin"/>
+                <w:sz w:val="21"/>
+                <w:szCs w:val="21"/>
+                <w:rtl/>
+              </w:rPr>
+              <w:t>0.825</w:t>
+            </w:r>
+          </w:p>
+        </w:tc>
+        <w:tc>
+          <w:tcPr>
+            <w:tcW w:type="dxa" w:w="2412"/>
+          </w:tcPr>
+          <w:p>
+            <w:pPr>
+              <w:jc w:val="center"/>
+            </w:pPr>
+            <w:r/>
+            <w:r>
+              <w:rPr>
+                <w:rFonts w:ascii="Times New Roman" w:hAnsi="Times New Roman" w:cs="B Nazanin"/>
+                <w:sz w:val="21"/>
+                <w:szCs w:val="21"/>
+                <w:rtl/>
+              </w:rPr>
+              <w:t>0.785</w:t>
+            </w:r>
+          </w:p>
+        </w:tc>
+        <w:tc>
+          <w:tcPr>
+            <w:tcW w:type="dxa" w:w="2412"/>
+          </w:tcPr>
+          <w:p>
+            <w:pPr>
+              <w:jc w:val="center"/>
+            </w:pPr>
+            <w:r/>
+            <w:r>
+              <w:rPr>
+                <w:rFonts w:ascii="Times New Roman" w:hAnsi="Times New Roman" w:cs="B Nazanin"/>
+                <w:sz w:val="21"/>
+                <w:szCs w:val="21"/>
+                <w:rtl/>
+              </w:rPr>
+              <w:t>0.747</w:t>
+            </w:r>
+          </w:p>
+        </w:tc>
+      </w:tr>
+      <w:tr>
+        <w:tc>
+          <w:tcPr>
+            <w:tcW w:type="dxa" w:w="2412"/>
+          </w:tcPr>
+          <w:p>
+            <w:pPr>
+              <w:jc w:val="right"/>
+            </w:pPr>
+            <w:r/>
+            <w:r>
+              <w:rPr>
+                <w:rFonts w:ascii="Times New Roman" w:hAnsi="Times New Roman" w:cs="B Nazanin"/>
+                <w:sz w:val="21"/>
+                <w:szCs w:val="21"/>
+                <w:rtl/>
+              </w:rPr>
+              <w:t>Quran</w:t>
+            </w:r>
+          </w:p>
+        </w:tc>
+        <w:tc>
+          <w:tcPr>
+            <w:tcW w:type="dxa" w:w="2412"/>
+          </w:tcPr>
+          <w:p>
+            <w:pPr>
+              <w:jc w:val="center"/>
+            </w:pPr>
+            <w:r/>
+            <w:r>
+              <w:rPr>
+                <w:b/>
+                <w:rFonts w:ascii="Times New Roman" w:hAnsi="Times New Roman" w:cs="B Nazanin"/>
+                <w:sz w:val="21"/>
+                <w:szCs w:val="21"/>
+                <w:rtl/>
+              </w:rPr>
+              <w:t>0.358</w:t>
+            </w:r>
+          </w:p>
+        </w:tc>
+        <w:tc>
+          <w:tcPr>
+            <w:tcW w:type="dxa" w:w="2412"/>
+          </w:tcPr>
+          <w:p>
+            <w:pPr>
+              <w:jc w:val="center"/>
+            </w:pPr>
+            <w:r/>
+            <w:r>
+              <w:rPr>
+                <w:rFonts w:ascii="Times New Roman" w:hAnsi="Times New Roman" w:cs="B Nazanin"/>
+                <w:sz w:val="21"/>
+                <w:szCs w:val="21"/>
+                <w:rtl/>
+              </w:rPr>
+              <w:t>0.155</w:t>
+            </w:r>
+          </w:p>
+        </w:tc>
+        <w:tc>
+          <w:tcPr>
+            <w:tcW w:type="dxa" w:w="2412"/>
+          </w:tcPr>
+          <w:p>
+            <w:pPr>
+              <w:jc w:val="center"/>
+            </w:pPr>
+            <w:r/>
+            <w:r>
+              <w:rPr>
+                <w:rFonts w:ascii="Times New Roman" w:hAnsi="Times New Roman" w:cs="B Nazanin"/>
+                <w:sz w:val="21"/>
+                <w:szCs w:val="21"/>
+                <w:rtl/>
+              </w:rPr>
+              <w:t>0.235</w:t>
+            </w:r>
+          </w:p>
+        </w:tc>
+      </w:tr>
+      <w:tr>
+        <w:tc>
+          <w:tcPr>
+            <w:tcW w:type="dxa" w:w="2412"/>
+          </w:tcPr>
+          <w:p>
+            <w:pPr>
+              <w:jc w:val="right"/>
+            </w:pPr>
+            <w:r/>
+            <w:r>
+              <w:rPr>
+                <w:rFonts w:ascii="Times New Roman" w:hAnsi="Times New Roman" w:cs="B Nazanin"/>
+                <w:sz w:val="21"/>
+                <w:szCs w:val="21"/>
+                <w:rtl/>
+              </w:rPr>
+              <w:t>Mr.TyDi-ar</w:t>
+            </w:r>
+          </w:p>
+        </w:tc>
+        <w:tc>
+          <w:tcPr>
+            <w:tcW w:type="dxa" w:w="2412"/>
+          </w:tcPr>
+          <w:p>
+            <w:pPr>
+              <w:jc w:val="center"/>
+            </w:pPr>
+            <w:r/>
+            <w:r>
+              <w:rPr>
+                <w:rFonts w:ascii="Times New Roman" w:hAnsi="Times New Roman" w:cs="B Nazanin"/>
+                <w:sz w:val="21"/>
+                <w:szCs w:val="21"/>
+                <w:rtl/>
+              </w:rPr>
+              <w:t>0.544</w:t>
+            </w:r>
+          </w:p>
+        </w:tc>
+        <w:tc>
+          <w:tcPr>
+            <w:tcW w:type="dxa" w:w="2412"/>
+          </w:tcPr>
+          <w:p>
+            <w:pPr>
+              <w:jc w:val="center"/>
+            </w:pPr>
+            <w:r/>
+            <w:r>
+              <w:rPr>
+                <w:rFonts w:ascii="Times New Roman" w:hAnsi="Times New Roman" w:cs="B Nazanin"/>
+                <w:sz w:val="21"/>
+                <w:szCs w:val="21"/>
+                <w:rtl/>
+              </w:rPr>
+              <w:t>0.881</w:t>
+            </w:r>
+          </w:p>
+        </w:tc>
+        <w:tc>
+          <w:tcPr>
+            <w:tcW w:type="dxa" w:w="2412"/>
+          </w:tcPr>
+          <w:p>
+            <w:pPr>
+              <w:jc w:val="center"/>
+            </w:pPr>
+            <w:r/>
+            <w:r>
+              <w:rPr>
+                <w:b/>
+                <w:rFonts w:ascii="Times New Roman" w:hAnsi="Times New Roman" w:cs="B Nazanin"/>
+                <w:sz w:val="21"/>
+                <w:szCs w:val="21"/>
+                <w:rtl/>
+              </w:rPr>
+              <w:t>0.989</w:t>
+            </w:r>
+          </w:p>
+        </w:tc>
+      </w:tr>
+      <w:tr>
+        <w:tc>
+          <w:tcPr>
+            <w:tcW w:type="dxa" w:w="2412"/>
+          </w:tcPr>
+          <w:p>
+            <w:pPr>
+              <w:jc w:val="right"/>
+            </w:pPr>
+            <w:r/>
+            <w:r>
+              <w:rPr>
+                <w:rFonts w:ascii="Times New Roman" w:hAnsi="Times New Roman" w:cs="B Nazanin"/>
+                <w:sz w:val="21"/>
+                <w:szCs w:val="21"/>
+                <w:rtl/>
+              </w:rPr>
+              <w:t>MIRACL-ar</w:t>
+            </w:r>
+          </w:p>
+        </w:tc>
+        <w:tc>
+          <w:tcPr>
+            <w:tcW w:type="dxa" w:w="2412"/>
+          </w:tcPr>
+          <w:p>
+            <w:pPr>
+              <w:jc w:val="center"/>
+            </w:pPr>
+            <w:r/>
+            <w:r>
+              <w:rPr>
+                <w:rFonts w:ascii="Times New Roman" w:hAnsi="Times New Roman" w:cs="B Nazanin"/>
+                <w:sz w:val="21"/>
+                <w:szCs w:val="21"/>
+                <w:rtl/>
+              </w:rPr>
+              <w:t>0.542</w:t>
+            </w:r>
+          </w:p>
+        </w:tc>
+        <w:tc>
+          <w:tcPr>
+            <w:tcW w:type="dxa" w:w="2412"/>
+          </w:tcPr>
+          <w:p>
+            <w:pPr>
+              <w:jc w:val="center"/>
+            </w:pPr>
+            <w:r/>
+            <w:r>
+              <w:rPr>
+                <w:rFonts w:ascii="Times New Roman" w:hAnsi="Times New Roman" w:cs="B Nazanin"/>
+                <w:sz w:val="21"/>
+                <w:szCs w:val="21"/>
+                <w:rtl/>
+              </w:rPr>
+              <w:t>0.815</w:t>
+            </w:r>
+          </w:p>
+        </w:tc>
+        <w:tc>
+          <w:tcPr>
+            <w:tcW w:type="dxa" w:w="2412"/>
+          </w:tcPr>
+          <w:p>
+            <w:pPr>
+              <w:jc w:val="center"/>
+            </w:pPr>
+            <w:r/>
+            <w:r>
+              <w:rPr>
+                <w:b/>
+                <w:rFonts w:ascii="Times New Roman" w:hAnsi="Times New Roman" w:cs="B Nazanin"/>
+                <w:sz w:val="21"/>
+                <w:szCs w:val="21"/>
+                <w:rtl/>
+              </w:rPr>
+              <w:t>0.860</w:t>
+            </w:r>
+          </w:p>
+        </w:tc>
+      </w:tr>
+    </w:tbl>
+    <w:p/>
+    <w:p>
+      <w:pPr>
+        <w:jc w:val="right"/>
+        <w:bidi/>
+      </w:pPr>
+      <w:r>
+        <w:rPr>
+          <w:rFonts w:ascii="Times New Roman" w:hAnsi="Times New Roman" w:cs="B Nazanin"/>
+          <w:sz w:val="24"/>
+          <w:szCs w:val="24"/>
+          <w:rtl/>
+        </w:rPr>
+        <w:t xml:space="preserve">منبع: </w:t>
+      </w:r>
+      <w:r>
+        <w:rPr>
+          <w:rFonts w:ascii="Consolas" w:hAnsi="Consolas" w:cs="Consolas"/>
+          <w:sz w:val="21"/>
+          <w:szCs w:val="21"/>
+        </w:rPr>
+        <w:t>outputs/dense_e5_summary.json</w:t>
+      </w:r>
+      <w:r>
+        <w:rPr>
+          <w:rFonts w:ascii="Times New Roman" w:hAnsi="Times New Roman" w:cs="B Nazanin"/>
+          <w:sz w:val="24"/>
+          <w:szCs w:val="24"/>
+          <w:rtl/>
+        </w:rPr>
+        <w:t xml:space="preserve"> و </w:t>
+      </w:r>
+      <w:r>
+        <w:rPr>
+          <w:rFonts w:ascii="Consolas" w:hAnsi="Consolas" w:cs="Consolas"/>
+          <w:sz w:val="21"/>
+          <w:szCs w:val="21"/>
+        </w:rPr>
+        <w:t>scripts/dense_e5_all.py</w:t>
+      </w:r>
+      <w:r>
+        <w:rPr>
+          <w:rFonts w:ascii="Times New Roman" w:hAnsi="Times New Roman" w:cs="B Nazanin"/>
+          <w:sz w:val="24"/>
+          <w:szCs w:val="24"/>
+          <w:rtl/>
+        </w:rPr>
+        <w:t>؛ ردیف‌های TyDi/MIRACL از بخش ۴-۴-۴.</w:t>
+      </w:r>
+    </w:p>
+    <w:p>
+      <w:pPr>
+        <w:jc w:val="right"/>
+        <w:bidi/>
+      </w:pPr>
+      <w:r>
+        <w:rPr>
+          <w:b/>
+          <w:rFonts w:ascii="Times New Roman" w:hAnsi="Times New Roman" w:cs="B Nazanin"/>
+          <w:sz w:val="24"/>
+          <w:szCs w:val="24"/>
+          <w:rtl/>
+        </w:rPr>
+        <w:t>الگو:</w:t>
+      </w:r>
+      <w:r>
+        <w:rPr>
+          <w:rFonts w:ascii="Times New Roman" w:hAnsi="Times New Roman" w:cs="B Nazanin"/>
+          <w:sz w:val="24"/>
+          <w:szCs w:val="24"/>
+          <w:rtl/>
+        </w:rPr>
+        <w:t xml:space="preserve"> در دامنه‌های بستهٔ تخصصی (۶ از ۸ مجموعهٔ اصلی) بهترین SF جلوتر یا هم‌تراز E5 است؛ در بازدامنهٔ دانشنامه‌ای (TyDi/MIRACL) و موجودیت‌محور، تراکمی‌ها غالب‌اند — مرزی که در بخش ۴-۴-۴ تحلیل شد.</w:t>
+      </w:r>
+    </w:p>
+    <w:p>
+      <w:pPr>
         <w:spacing w:before="200" w:after="120"/>
         <w:jc w:val="right"/>
         <w:bidi/>
@@ -14919,7 +16982,7 @@
           <w:szCs w:val="24"/>
           <w:rtl/>
         </w:rPr>
-        <w:t>جدول ۴-۸.</w:t>
+        <w:t>جدول ۴-۹.</w:t>
       </w:r>
       <w:r>
         <w:rPr>
@@ -15689,6 +17752,40 @@
     </w:p>
     <w:p>
       <w:pPr>
+        <w:jc w:val="right"/>
+        <w:bidi/>
+      </w:pPr>
+      <w:r>
+        <w:rPr>
+          <w:rFonts w:ascii="Times New Roman" w:hAnsi="Times New Roman" w:cs="B Nazanin"/>
+          <w:sz w:val="24"/>
+          <w:szCs w:val="24"/>
+          <w:rtl/>
+        </w:rPr>
+        <w:t xml:space="preserve">6. </w:t>
+      </w:r>
+      <w:r>
+        <w:rPr>
+          <w:b/>
+          <w:rFonts w:ascii="Times New Roman" w:hAnsi="Times New Roman" w:cs="B Nazanin"/>
+          <w:sz w:val="24"/>
+          <w:szCs w:val="24"/>
+          <w:rtl/>
+        </w:rPr>
+        <w:t>بازدامنهٔ دانشنامه‌ای عربی (TyDi/MIRACL pooled):</w:t>
+      </w:r>
+      <w:r>
+        <w:rPr>
+          <w:rFonts w:ascii="Times New Roman" w:hAnsi="Times New Roman" w:cs="B Nazanin"/>
+          <w:sz w:val="24"/>
+          <w:szCs w:val="24"/>
+          <w:rtl/>
+        </w:rPr>
+        <w:t xml:space="preserve"> MRR≈0.54 در برابر BM25≈0.85 و E5≈0.93 میانگین — ظرفیت گرید 64×64 برای تنوع واژگانی ویکی‌پدیا کافی نیست؛ مرز کاربرد روش، دامنه بستهٔ تخصصی است (بخش ۴-۴-۴).</w:t>
+      </w:r>
+    </w:p>
+    <w:p>
+      <w:pPr>
         <w:spacing w:before="200" w:after="120"/>
         <w:jc w:val="right"/>
         <w:bidi/>
@@ -15771,7 +17868,7 @@
           <w:szCs w:val="24"/>
           <w:rtl/>
         </w:rPr>
-        <w:t>این پایان‌نامه نخستین ارزیابی نظام‌مند رویکرد خوشه‌بندی معنایی را در سناریوی بازیابی/پاسخگویی در دامنه بسته و متون چندزبانه ارائه کرد. خط لولهٔ هشت‌مرحله‌ای پروپوزال به یک سامانهٔ بازتولیدپذیر تبدیل شد و روی ۱۲ مجموعه‌داده استاندارد، با دو خط مبنای واژگانی/عصبی (BM25، SPLADE) و آزمون‌های معناداری آماری سنجیده شد.</w:t>
+        <w:t>این پایان‌نامه نخستین ارزیابی نظام‌مند رویکرد خوشه‌بندی معنایی را در سناریوی بازیابی/پاسخگویی در دامنه بسته و متون چندزبانه ارائه کرد. خط لولهٔ هشت‌مرحله‌ای پروپوزال به یک سامانهٔ بازتولیدپذیر تبدیل شد و روی ۱۴ مجموعه‌داده استاندارد، با دو خط مبنای واژگانی/عصبی (BM25، SPLADE) و آزمون‌های معناداری آماری سنجیده شد.</w:t>
       </w:r>
     </w:p>
     <w:p>
@@ -16333,7 +18430,7 @@
           <w:szCs w:val="24"/>
           <w:rtl/>
         </w:rPr>
-        <w:t>سامانه‌های پاسخگویی خودکار به سوال در حوزه‌های تخصصی با دو محدودیت اساسی روبه‌رو هستند: نیازمندی مدل‌های عصبی بزرگ به منابع پردازشی سنگین و دادهٔ برچسب‌خورده فراوان. این پایان‌نامه کاربرد رویکرد زیست‌الهامی «خوشه‌بندی معنایی» را برای پاسخگویی به سوالات در محیط‌های با دامنه بسته و بر پایهٔ متون چندزبانه بررسی، ارزیابی و تحلیل می‌کند. در روش پیشنهادی، متون دامنه ابتدا به مفاهیم معنایی مجزا تقسیم و واژگان آن‌ها استخراج می‌شود؛ سپس با الگوریتم‌های کاهش بعد، نقشهٔ معنایی دوبعدی ساخته شده و هر واژه/قطعه‌متن به اثرانگشت معنایی پراکندهٔ دودویی نگاشت می‌گردد؛ پاسخگویی با مقایسهٔ اثرانگشت پرس‌وجو و اسناد انجام می‌شود. برای ارتقای کیفیت، وزن‌دهی TF-IDF مبتنی بر هم‌رخدادی واژه–مفهوم، انتشار فعال‌سازی فضایی و فیوژن خطی با مدل عصبی SPLADE به کار گرفته شد. سامانه روی ۱۲ مجموعه‌داده استاندارد — از جمله قرآن کریم (۶٬۲۳۶ آیه) و پیکرهٔ دوزبانهٔ عربی–انگلیسی (۴۸۸ قطعه) — ارزیابی شد. نتایج نشان می‌دهد روش پیشنهادی در متون دوزبانه به‌طور معنادار (p&lt;0.05) از BM25 قوی‌تر است، روی قرآن در تمامی معیارها تا سه برابر بهتر عمل می‌کند ، در SciFact هم از BM25 و هم از یک مدل بازیابی تراکمی عصبی جلوتر است؛ درحالی‌که سرعت پاسخگویی آن چندین مرتبهٔ بزرگی از مدل‌های تراکمی بالاتر است. این نتایج، خوشه‌بندی معنایی را به گزینه‌ای کارآمد برای سامانه‌های پرسش‌وپاسخ سبک در دامنه‌های تخصصی چندزبانه تبدیل می‌کند.</w:t>
+        <w:t>سامانه‌های پاسخگویی خودکار به سوال در حوزه‌های تخصصی با دو محدودیت اساسی روبه‌رو هستند: نیازمندی مدل‌های عصبی بزرگ به منابع پردازشی سنگین و دادهٔ برچسب‌خورده فراوان. این پایان‌نامه کاربرد رویکرد زیست‌الهامی «خوشه‌بندی معنایی» را برای پاسخگویی به سوالات در محیط‌های با دامنه بسته و بر پایهٔ متون چندزبانه بررسی، ارزیابی و تحلیل می‌کند. در روش پیشنهادی، متون دامنه ابتدا به مفاهیم معنایی مجزا تقسیم و واژگان آن‌ها استخراج می‌شود؛ سپس با الگوریتم‌های کاهش بعد، نقشهٔ معنایی دوبعدی ساخته شده و هر واژه/قطعه‌متن به اثرانگشت معنایی پراکندهٔ دودویی نگاشت می‌گردد؛ پاسخگویی با مقایسهٔ اثرانگشت پرس‌وجو و اسناد انجام می‌شود. برای ارتقای کیفیت، وزن‌دهی TF-IDF مبتنی بر هم‌رخدادی واژه–مفهوم، انتشار فعال‌سازی فضایی و فیوژن خطی با مدل عصبی SPLADE به کار گرفته شد. سامانه روی ۱۴ مجموعه‌داده استاندارد — از جمله قرآن کریم (۶٬۲۳۶ آیه) و پیکرهٔ دوزبانهٔ عربی–انگلیسی (۴۸۸ قطعه) — ارزیابی شد. نتایج نشان می‌دهد روش پیشنهادی در متون دوزبانه به‌طور معنادار (p&lt;0.05) از BM25 قوی‌تر است، روی قرآن در تمامی معیارها تا سه برابر بهتر عمل می‌کند ، در SciFact هم از BM25 و هم از یک مدل بازیابی تراکمی عصبی جلوتر است؛ درحالی‌که سرعت پاسخگویی آن چندین مرتبهٔ بزرگی از مدل‌های تراکمی بالاتر است. این نتایج، خوشه‌بندی معنایی را به گزینه‌ای کارآمد برای سامانه‌های پرسش‌وپاسخ سبک در دامنه‌های تخصصی چندزبانه تبدیل می‌کند.</w:t>
       </w:r>
     </w:p>
     <w:p>
@@ -20001,6 +22098,66 @@
           <w:szCs w:val="24"/>
         </w:rPr>
         <w:t>, vol. 6, pp. 322–338, 2018, doi: 10.1162/tacl_a_00023.</w:t>
+      </w:r>
+    </w:p>
+    <w:p>
+      <w:pPr>
+        <w:jc w:val="left"/>
+      </w:pPr>
+      <w:r>
+        <w:rPr>
+          <w:rFonts w:ascii="Times New Roman" w:hAnsi="Times New Roman" w:cs="B Nazanin"/>
+          <w:sz w:val="24"/>
+          <w:szCs w:val="24"/>
+        </w:rPr>
+        <w:t xml:space="preserve">[59] J. Clark, D. Garrette, I. Turc, and J. Wieting, "MR. TyDi: A Multi-lingual Typed Natural Language Baseline Dataset," in </w:t>
+      </w:r>
+      <w:r>
+        <w:rPr>
+          <w:i/>
+          <w:rFonts w:ascii="Times New Roman" w:hAnsi="Times New Roman" w:cs="B Nazanin"/>
+          <w:sz w:val="24"/>
+          <w:szCs w:val="24"/>
+        </w:rPr>
+        <w:t>Proc. ACL-IJCNLP</w:t>
+      </w:r>
+      <w:r>
+        <w:rPr>
+          <w:rFonts w:ascii="Times New Roman" w:hAnsi="Times New Roman" w:cs="B Nazanin"/>
+          <w:sz w:val="24"/>
+          <w:szCs w:val="24"/>
+        </w:rPr>
+        <w:t>, 2021, doi: 10.18653/v1/2021.acl-long.563.</w:t>
+      </w:r>
+    </w:p>
+    <w:p>
+      <w:pPr>
+        <w:jc w:val="left"/>
+      </w:pPr>
+      <w:r>
+        <w:rPr>
+          <w:rFonts w:ascii="Times New Roman" w:hAnsi="Times New Roman" w:cs="B Nazanin"/>
+          <w:sz w:val="24"/>
+          <w:szCs w:val="24"/>
+        </w:rPr>
+        <w:t xml:space="preserve">[60] X. Zhang et al., "MIRACL: A Multilingual Retrieval Dataset Covering 73 Languages," in </w:t>
+      </w:r>
+      <w:r>
+        <w:rPr>
+          <w:i/>
+          <w:rFonts w:ascii="Times New Roman" w:hAnsi="Times New Roman" w:cs="B Nazanin"/>
+          <w:sz w:val="24"/>
+          <w:szCs w:val="24"/>
+        </w:rPr>
+        <w:t>Proc. VLDB Endowment</w:t>
+      </w:r>
+      <w:r>
+        <w:rPr>
+          <w:rFonts w:ascii="Times New Roman" w:hAnsi="Times New Roman" w:cs="B Nazanin"/>
+          <w:sz w:val="24"/>
+          <w:szCs w:val="24"/>
+        </w:rPr>
+        <w:t>, vol. 17, no. 10, 2024, arXiv:2210.09984.</w:t>
       </w:r>
     </w:p>
     <w:sectPr>

</xml_diff>